<commit_message>
Add week2 analysis pipeline with PDF reports, charts, and Folium maps - Modularize analysis.py with reusable data-loading and aggregation functions - Add visualizations.py: matplotlib bar charts and heatmaps embedded in PDF - Add analysis_no_training_flights.py: same report excluding training/test flights - Add maps.py: Folium interactive maps (dock coverage circles, incident heatmap)
</commit_message>
<xml_diff>
--- a/Notes.docx
+++ b/Notes.docx
@@ -167,7 +167,39 @@
         <w:t>Testing</w:t>
       </w:r>
     </w:p>
-    <w:p/>
+    <w:p>
+      <w:proofErr w:type="spellStart"/>
+      <w:r>
+        <w:t>Categoria</w:t>
+      </w:r>
+      <w:proofErr w:type="spellEnd"/>
+      <w:r>
+        <w:t xml:space="preserve"> </w:t>
+      </w:r>
+      <w:proofErr w:type="spellStart"/>
+      <w:r>
+        <w:t>agrupandolas</w:t>
+      </w:r>
+      <w:proofErr w:type="spellEnd"/>
+      <w:r>
+        <w:t xml:space="preserve"> </w:t>
+      </w:r>
+      <w:proofErr w:type="spellStart"/>
+      <w:r>
+        <w:t>todas</w:t>
+      </w:r>
+      <w:proofErr w:type="spellEnd"/>
+      <w:r>
+        <w:t xml:space="preserve">: </w:t>
+      </w:r>
+      <w:r>
+        <w:rPr>
+          <w:b/>
+          <w:bCs/>
+        </w:rPr>
+        <w:t>Training/Test flights</w:t>
+      </w:r>
+    </w:p>
     <w:p/>
     <w:p>
       <w:pPr>
@@ -235,6 +267,12 @@
       <w:r>
         <w:t>Scene reconstruction</w:t>
       </w:r>
+      <w:r>
+        <w:t xml:space="preserve">: </w:t>
+      </w:r>
+      <w:r>
+        <w:t>provided overhead thermal view/ terminate fire watch from second alarm fire earlier this date.</w:t>
+      </w:r>
     </w:p>
     <w:p>
       <w:pPr>
@@ -243,9 +281,35 @@
           <w:ilvl w:val="0"/>
           <w:numId w:val="2"/>
         </w:numPr>
-      </w:pPr>
-      <w:r>
+        <w:rPr>
+          <w:highlight w:val="red"/>
+        </w:rPr>
+      </w:pPr>
+      <w:r>
+        <w:rPr>
+          <w:highlight w:val="red"/>
+        </w:rPr>
         <w:t>Search &amp; rescue</w:t>
+      </w:r>
+      <w:r>
+        <w:rPr>
+          <w:highlight w:val="red"/>
+        </w:rPr>
+        <w:t xml:space="preserve">: </w:t>
+      </w:r>
+    </w:p>
+    <w:p>
+      <w:pPr>
+        <w:pStyle w:val="ListParagraph"/>
+      </w:pPr>
+      <w:r>
+        <w:t>How did the drone assist with the call? - Additional details</w:t>
+      </w:r>
+      <w:r>
+        <w:t xml:space="preserve">: </w:t>
+      </w:r>
+      <w:r>
+        <w:t>Attempt to located endangered missing</w:t>
       </w:r>
     </w:p>
     <w:p>
@@ -275,7 +339,27 @@
         </w:numPr>
       </w:pPr>
       <w:r>
+        <w:rPr>
+          <w:highlight w:val="red"/>
+        </w:rPr>
         <w:t>Search &amp; rescue, Dispatch call for service</w:t>
+      </w:r>
+      <w:r>
+        <w:rPr>
+          <w:highlight w:val="red"/>
+        </w:rPr>
+        <w:t>:</w:t>
+      </w:r>
+      <w:r>
+        <w:t xml:space="preserve"> no </w:t>
+      </w:r>
+      <w:proofErr w:type="spellStart"/>
+      <w:r>
+        <w:t>tiene</w:t>
+      </w:r>
+      <w:proofErr w:type="spellEnd"/>
+      <w:r>
+        <w:t xml:space="preserve"> additional notes or details</w:t>
       </w:r>
     </w:p>
     <w:p>
@@ -289,6 +373,17 @@
       <w:r>
         <w:t>Flock hit - Stolen Vehicle LMPD25129304 Did not locate</w:t>
       </w:r>
+      <w:r>
+        <w:t xml:space="preserve">: no </w:t>
+      </w:r>
+      <w:proofErr w:type="spellStart"/>
+      <w:r>
+        <w:t>tiene</w:t>
+      </w:r>
+      <w:proofErr w:type="spellEnd"/>
+      <w:r>
+        <w:t xml:space="preserve"> details</w:t>
+      </w:r>
     </w:p>
     <w:p>
       <w:pPr>
@@ -317,7 +412,27 @@
         </w:numPr>
       </w:pPr>
       <w:r>
+        <w:rPr>
+          <w:highlight w:val="red"/>
+        </w:rPr>
         <w:t>Dispatch call for service, Search &amp; rescue</w:t>
+      </w:r>
+      <w:r>
+        <w:rPr>
+          <w:highlight w:val="red"/>
+        </w:rPr>
+        <w:t>:</w:t>
+      </w:r>
+      <w:r>
+        <w:t xml:space="preserve"> no </w:t>
+      </w:r>
+      <w:proofErr w:type="spellStart"/>
+      <w:r>
+        <w:t>tiene</w:t>
+      </w:r>
+      <w:proofErr w:type="spellEnd"/>
+      <w:r>
+        <w:t xml:space="preserve"> details</w:t>
       </w:r>
     </w:p>
     <w:p>
@@ -345,10 +460,72 @@
           <w:ilvl w:val="0"/>
           <w:numId w:val="2"/>
         </w:numPr>
+        <w:rPr>
+          <w:lang w:val="es-419"/>
+        </w:rPr>
       </w:pPr>
       <w:r>
         <w:t>Assist with locating suspects</w:t>
       </w:r>
+      <w:r>
+        <w:t xml:space="preserve">: no </w:t>
+      </w:r>
+      <w:proofErr w:type="spellStart"/>
+      <w:r>
+        <w:t>tiene</w:t>
+      </w:r>
+      <w:proofErr w:type="spellEnd"/>
+      <w:r>
+        <w:t xml:space="preserve"> details. </w:t>
+      </w:r>
+      <w:proofErr w:type="spellStart"/>
+      <w:r>
+        <w:rPr>
+          <w:lang w:val="es-419"/>
+        </w:rPr>
+        <w:t>InicdentID</w:t>
+      </w:r>
+      <w:proofErr w:type="spellEnd"/>
+      <w:r>
+        <w:rPr>
+          <w:lang w:val="es-419"/>
+        </w:rPr>
+        <w:t xml:space="preserve">: </w:t>
+      </w:r>
+      <w:r>
+        <w:rPr>
+          <w:lang w:val="es-419"/>
+        </w:rPr>
+        <w:t>NFSU 25-185 =&gt; esto puede s</w:t>
+      </w:r>
+      <w:r>
+        <w:rPr>
+          <w:lang w:val="es-419"/>
+        </w:rPr>
+        <w:t xml:space="preserve">ervir para buscar </w:t>
+      </w:r>
+      <w:proofErr w:type="spellStart"/>
+      <w:r>
+        <w:rPr>
+          <w:lang w:val="es-419"/>
+        </w:rPr>
+        <w:t>mas</w:t>
+      </w:r>
+      <w:proofErr w:type="spellEnd"/>
+      <w:r>
+        <w:rPr>
+          <w:lang w:val="es-419"/>
+        </w:rPr>
+        <w:t xml:space="preserve"> información sobre el </w:t>
+      </w:r>
+      <w:proofErr w:type="spellStart"/>
+      <w:r>
+        <w:rPr>
+          <w:lang w:val="es-419"/>
+        </w:rPr>
+        <w:t>flight</w:t>
+      </w:r>
+      <w:proofErr w:type="spellEnd"/>
     </w:p>
     <w:p>
       <w:pPr>
@@ -357,9 +534,63 @@
           <w:ilvl w:val="0"/>
           <w:numId w:val="2"/>
         </w:numPr>
+        <w:rPr>
+          <w:lang w:val="es-419"/>
+        </w:rPr>
       </w:pPr>
       <w:r>
         <w:t>Passing check</w:t>
+      </w:r>
+      <w:r>
+        <w:t xml:space="preserve">: no </w:t>
+      </w:r>
+      <w:proofErr w:type="spellStart"/>
+      <w:r>
+        <w:t>tiene</w:t>
+      </w:r>
+      <w:proofErr w:type="spellEnd"/>
+      <w:r>
+        <w:t xml:space="preserve"> details. </w:t>
+      </w:r>
+      <w:r>
+        <w:rPr>
+          <w:lang w:val="es-419"/>
+        </w:rPr>
+        <w:t>Fue un vuelo corto (</w:t>
+      </w:r>
+      <w:proofErr w:type="spellStart"/>
+      <w:r>
+        <w:rPr>
+          <w:lang w:val="es-419"/>
+        </w:rPr>
+        <w:t>D</w:t>
+      </w:r>
+      <w:r>
+        <w:rPr>
+          <w:lang w:val="es-419"/>
+        </w:rPr>
+        <w:t>uration</w:t>
+      </w:r>
+      <w:proofErr w:type="spellEnd"/>
+      <w:r>
+        <w:rPr>
+          <w:lang w:val="es-419"/>
+        </w:rPr>
+        <w:t xml:space="preserve">: 145 </w:t>
+      </w:r>
+      <w:proofErr w:type="spellStart"/>
+      <w:r>
+        <w:rPr>
+          <w:lang w:val="es-419"/>
+        </w:rPr>
+        <w:t>seconds</w:t>
+      </w:r>
+      <w:proofErr w:type="spellEnd"/>
+      <w:r>
+        <w:rPr>
+          <w:lang w:val="es-419"/>
+        </w:rPr>
+        <w:t>)</w:t>
       </w:r>
     </w:p>
     <w:p>
@@ -391,6 +622,15 @@
       <w:r>
         <w:t>Failed flight - lost connection to drone</w:t>
       </w:r>
+      <w:r>
+        <w:t xml:space="preserve">: Other notes: </w:t>
+      </w:r>
+      <w:r>
+        <w:t>Failed deployment</w:t>
+      </w:r>
+      <w:r>
+        <w:t>, Duration: 59seconds</w:t>
+      </w:r>
     </w:p>
     <w:p>
       <w:pPr>
@@ -403,6 +643,23 @@
       <w:r>
         <w:t>Event overwatch, Support 2nd Division Impact - wanted suspect</w:t>
       </w:r>
+      <w:r>
+        <w:t>:</w:t>
+      </w:r>
+    </w:p>
+    <w:p>
+      <w:pPr>
+        <w:pStyle w:val="ListParagraph"/>
+      </w:pPr>
+      <w:r>
+        <w:t>How did the drone assist with the call?</w:t>
+      </w:r>
+      <w:r>
+        <w:t xml:space="preserve">: </w:t>
+      </w:r>
+      <w:r>
+        <w:t>Located person, Provided overwatch, Helped make arrest</w:t>
+      </w:r>
     </w:p>
     <w:p>
       <w:pPr>
@@ -419,13 +676,7 @@
         <w:rPr>
           <w:highlight w:val="yellow"/>
         </w:rPr>
-        <w:t>t</w:t>
-      </w:r>
-      <w:r>
-        <w:rPr>
-          <w:highlight w:val="yellow"/>
-        </w:rPr>
-        <w:t>esting</w:t>
+        <w:t>testing</w:t>
       </w:r>
     </w:p>
     <w:p>
@@ -443,6 +694,7 @@
         <w:rPr>
           <w:highlight w:val="yellow"/>
         </w:rPr>
+        <w:lastRenderedPageBreak/>
         <w:t>Testing</w:t>
       </w:r>
     </w:p>
@@ -492,6 +744,705 @@
         <w:t>)</w:t>
       </w:r>
     </w:p>
+    <w:p>
+      <w:pPr>
+        <w:rPr>
+          <w:highlight w:val="yellow"/>
+        </w:rPr>
+      </w:pPr>
+    </w:p>
+    <w:p>
+      <w:proofErr w:type="spellStart"/>
+      <w:r>
+        <w:t>Preguntas</w:t>
+      </w:r>
+      <w:proofErr w:type="spellEnd"/>
+      <w:r>
+        <w:t>:</w:t>
+      </w:r>
+    </w:p>
+    <w:p>
+      <w:pPr>
+        <w:pStyle w:val="ListParagraph"/>
+        <w:numPr>
+          <w:ilvl w:val="0"/>
+          <w:numId w:val="1"/>
+        </w:numPr>
+      </w:pPr>
+      <w:r>
+        <w:t>Study where incidents occur most frequently.</w:t>
+      </w:r>
+    </w:p>
+    <w:p>
+      <w:pPr>
+        <w:pStyle w:val="ListParagraph"/>
+        <w:numPr>
+          <w:ilvl w:val="0"/>
+          <w:numId w:val="1"/>
+        </w:numPr>
+      </w:pPr>
+      <w:r>
+        <w:t>Detect possible geographic concentrations of incidents.</w:t>
+      </w:r>
+    </w:p>
+    <w:p>
+      <w:pPr>
+        <w:rPr>
+          <w:lang w:val="es-419"/>
+        </w:rPr>
+      </w:pPr>
+      <w:r>
+        <w:rPr>
+          <w:lang w:val="es-419"/>
+        </w:rPr>
+        <w:t>Esta</w:t>
+      </w:r>
+      <w:r>
+        <w:rPr>
+          <w:lang w:val="es-419"/>
+        </w:rPr>
+        <w:t>s</w:t>
+      </w:r>
+      <w:r>
+        <w:rPr>
+          <w:lang w:val="es-419"/>
+        </w:rPr>
+        <w:t xml:space="preserve"> tarea</w:t>
+      </w:r>
+      <w:r>
+        <w:rPr>
+          <w:lang w:val="es-419"/>
+        </w:rPr>
+        <w:t>s</w:t>
+      </w:r>
+      <w:r>
+        <w:rPr>
+          <w:lang w:val="es-419"/>
+        </w:rPr>
+        <w:t xml:space="preserve"> no tiene</w:t>
+      </w:r>
+      <w:r>
+        <w:rPr>
+          <w:lang w:val="es-419"/>
+        </w:rPr>
+        <w:t>n</w:t>
+      </w:r>
+      <w:r>
+        <w:rPr>
+          <w:lang w:val="es-419"/>
+        </w:rPr>
+        <w:t xml:space="preserve"> d</w:t>
+      </w:r>
+      <w:r>
+        <w:rPr>
+          <w:lang w:val="es-419"/>
+        </w:rPr>
+        <w:t>atos directos para desarrollarla</w:t>
+      </w:r>
+      <w:r>
+        <w:rPr>
+          <w:lang w:val="es-419"/>
+        </w:rPr>
+        <w:t xml:space="preserve"> (preguntar si existen registros de </w:t>
+      </w:r>
+      <w:proofErr w:type="spellStart"/>
+      <w:r>
+        <w:rPr>
+          <w:lang w:val="es-419"/>
+        </w:rPr>
+        <w:t>location</w:t>
+      </w:r>
+      <w:proofErr w:type="spellEnd"/>
+      <w:r>
+        <w:rPr>
+          <w:lang w:val="es-419"/>
+        </w:rPr>
+        <w:t xml:space="preserve"> de incidentes de cada </w:t>
+      </w:r>
+      <w:proofErr w:type="spellStart"/>
+      <w:r>
+        <w:rPr>
+          <w:lang w:val="es-419"/>
+        </w:rPr>
+        <w:t>flight</w:t>
+      </w:r>
+      <w:proofErr w:type="spellEnd"/>
+      <w:r>
+        <w:rPr>
+          <w:lang w:val="es-419"/>
+        </w:rPr>
+        <w:t xml:space="preserve">. La idea que tengo es relacionar el lugar del incidente con la base desde donde despego el </w:t>
+      </w:r>
+      <w:proofErr w:type="spellStart"/>
+      <w:r>
+        <w:rPr>
+          <w:lang w:val="es-419"/>
+        </w:rPr>
+        <w:t>drone</w:t>
+      </w:r>
+      <w:proofErr w:type="spellEnd"/>
+      <w:r>
+        <w:rPr>
+          <w:lang w:val="es-419"/>
+        </w:rPr>
+        <w:t>.</w:t>
+      </w:r>
+    </w:p>
+    <w:p>
+      <w:pPr>
+        <w:rPr>
+          <w:lang w:val="es-419"/>
+        </w:rPr>
+      </w:pPr>
+    </w:p>
+    <w:p>
+      <w:pPr>
+        <w:pStyle w:val="ListParagraph"/>
+        <w:numPr>
+          <w:ilvl w:val="0"/>
+          <w:numId w:val="1"/>
+        </w:numPr>
+        <w:rPr>
+          <w:lang w:val="es-419"/>
+        </w:rPr>
+      </w:pPr>
+      <w:r>
+        <w:rPr>
+          <w:lang w:val="es-419"/>
+        </w:rPr>
+        <w:t>Excluir los incidentes en la categoría Training o Test de las estadísticas para obtener realmente estadísticas de incidentes</w:t>
+      </w:r>
+    </w:p>
+    <w:p>
+      <w:pPr>
+        <w:pStyle w:val="ListParagraph"/>
+        <w:numPr>
+          <w:ilvl w:val="0"/>
+          <w:numId w:val="1"/>
+        </w:numPr>
+        <w:rPr>
+          <w:lang w:val="es-419"/>
+        </w:rPr>
+      </w:pPr>
+      <w:r>
+        <w:t>Response time summary statistics.</w:t>
+      </w:r>
+      <w:r>
+        <w:t xml:space="preserve"> ????</w:t>
+      </w:r>
+    </w:p>
+    <w:p>
+      <w:pPr>
+        <w:rPr>
+          <w:lang w:val="es-419"/>
+        </w:rPr>
+      </w:pPr>
+    </w:p>
+    <w:p/>
+    <w:p>
+      <w:r>
+        <w:rPr>
+          <w:b/>
+          <w:bCs/>
+        </w:rPr>
+        <w:t>Map 1 — Drone Coverage by Dock</w:t>
+      </w:r>
+      <w:r>
+        <w:t> Effective response radius: </w:t>
+      </w:r>
+      <w:r>
+        <w:rPr>
+          <w:b/>
+          <w:bCs/>
+        </w:rPr>
+        <w:t>2.0 miles (3.2 km)</w:t>
+      </w:r>
+    </w:p>
+    <w:tbl>
+      <w:tblPr>
+        <w:tblW w:w="0" w:type="auto"/>
+        <w:tblBorders>
+          <w:top w:val="single" w:sz="4" w:space="0" w:color="auto"/>
+          <w:left w:val="single" w:sz="4" w:space="0" w:color="auto"/>
+          <w:bottom w:val="single" w:sz="4" w:space="0" w:color="auto"/>
+          <w:right w:val="single" w:sz="4" w:space="0" w:color="auto"/>
+          <w:insideH w:val="single" w:sz="4" w:space="0" w:color="auto"/>
+          <w:insideV w:val="single" w:sz="4" w:space="0" w:color="auto"/>
+        </w:tblBorders>
+        <w:tblCellMar>
+          <w:top w:w="15" w:type="dxa"/>
+          <w:left w:w="15" w:type="dxa"/>
+          <w:bottom w:w="15" w:type="dxa"/>
+          <w:right w:w="15" w:type="dxa"/>
+        </w:tblCellMar>
+        <w:tblLook w:val="04A0" w:firstRow="1" w:lastRow="0" w:firstColumn="1" w:lastColumn="0" w:noHBand="0" w:noVBand="1"/>
+      </w:tblPr>
+      <w:tblGrid>
+        <w:gridCol w:w="5122"/>
+        <w:gridCol w:w="3271"/>
+      </w:tblGrid>
+      <w:tr>
+        <w:trPr>
+          <w:tblHeader/>
+        </w:trPr>
+        <w:tc>
+          <w:tcPr>
+            <w:tcW w:w="0" w:type="auto"/>
+            <w:noWrap/>
+            <w:tcMar>
+              <w:top w:w="75" w:type="dxa"/>
+              <w:left w:w="135" w:type="dxa"/>
+              <w:bottom w:w="75" w:type="dxa"/>
+              <w:right w:w="135" w:type="dxa"/>
+            </w:tcMar>
+            <w:vAlign w:val="center"/>
+            <w:hideMark/>
+          </w:tcPr>
+          <w:p>
+            <w:pPr>
+              <w:rPr>
+                <w:b/>
+                <w:bCs/>
+                <w:sz w:val="20"/>
+                <w:szCs w:val="20"/>
+              </w:rPr>
+            </w:pPr>
+            <w:r>
+              <w:rPr>
+                <w:b/>
+                <w:bCs/>
+                <w:sz w:val="20"/>
+                <w:szCs w:val="20"/>
+              </w:rPr>
+              <w:t>Parameter</w:t>
+            </w:r>
+          </w:p>
+        </w:tc>
+        <w:tc>
+          <w:tcPr>
+            <w:tcW w:w="0" w:type="auto"/>
+            <w:noWrap/>
+            <w:tcMar>
+              <w:top w:w="75" w:type="dxa"/>
+              <w:left w:w="135" w:type="dxa"/>
+              <w:bottom w:w="75" w:type="dxa"/>
+              <w:right w:w="135" w:type="dxa"/>
+            </w:tcMar>
+            <w:vAlign w:val="center"/>
+            <w:hideMark/>
+          </w:tcPr>
+          <w:p>
+            <w:pPr>
+              <w:rPr>
+                <w:b/>
+                <w:bCs/>
+                <w:sz w:val="20"/>
+                <w:szCs w:val="20"/>
+              </w:rPr>
+            </w:pPr>
+            <w:r>
+              <w:rPr>
+                <w:b/>
+                <w:bCs/>
+                <w:sz w:val="20"/>
+                <w:szCs w:val="20"/>
+              </w:rPr>
+              <w:t>Value</w:t>
+            </w:r>
+          </w:p>
+        </w:tc>
+      </w:tr>
+      <w:tr>
+        <w:tc>
+          <w:tcPr>
+            <w:tcW w:w="0" w:type="auto"/>
+            <w:noWrap/>
+            <w:tcMar>
+              <w:top w:w="75" w:type="dxa"/>
+              <w:left w:w="135" w:type="dxa"/>
+              <w:bottom w:w="75" w:type="dxa"/>
+              <w:right w:w="135" w:type="dxa"/>
+            </w:tcMar>
+            <w:vAlign w:val="center"/>
+            <w:hideMark/>
+          </w:tcPr>
+          <w:p>
+            <w:pPr>
+              <w:rPr>
+                <w:sz w:val="20"/>
+                <w:szCs w:val="20"/>
+              </w:rPr>
+            </w:pPr>
+            <w:proofErr w:type="spellStart"/>
+            <w:r>
+              <w:rPr>
+                <w:sz w:val="20"/>
+                <w:szCs w:val="20"/>
+              </w:rPr>
+              <w:t>Skydio</w:t>
+            </w:r>
+            <w:proofErr w:type="spellEnd"/>
+            <w:r>
+              <w:rPr>
+                <w:sz w:val="20"/>
+                <w:szCs w:val="20"/>
+              </w:rPr>
+              <w:t xml:space="preserve"> X10 max speed with standard obstacle avoidance</w:t>
+            </w:r>
+          </w:p>
+        </w:tc>
+        <w:tc>
+          <w:tcPr>
+            <w:tcW w:w="0" w:type="auto"/>
+            <w:noWrap/>
+            <w:tcMar>
+              <w:top w:w="75" w:type="dxa"/>
+              <w:left w:w="135" w:type="dxa"/>
+              <w:bottom w:w="75" w:type="dxa"/>
+              <w:right w:w="135" w:type="dxa"/>
+            </w:tcMar>
+            <w:vAlign w:val="center"/>
+            <w:hideMark/>
+          </w:tcPr>
+          <w:p>
+            <w:pPr>
+              <w:rPr>
+                <w:sz w:val="20"/>
+                <w:szCs w:val="20"/>
+              </w:rPr>
+            </w:pPr>
+            <w:r>
+              <w:rPr>
+                <w:sz w:val="20"/>
+                <w:szCs w:val="20"/>
+              </w:rPr>
+              <w:t>35.8 mph / 16 m/s</w:t>
+            </w:r>
+          </w:p>
+        </w:tc>
+      </w:tr>
+      <w:tr>
+        <w:tc>
+          <w:tcPr>
+            <w:tcW w:w="0" w:type="auto"/>
+            <w:noWrap/>
+            <w:tcMar>
+              <w:top w:w="75" w:type="dxa"/>
+              <w:left w:w="135" w:type="dxa"/>
+              <w:bottom w:w="75" w:type="dxa"/>
+              <w:right w:w="135" w:type="dxa"/>
+            </w:tcMar>
+            <w:vAlign w:val="center"/>
+            <w:hideMark/>
+          </w:tcPr>
+          <w:p>
+            <w:pPr>
+              <w:rPr>
+                <w:sz w:val="20"/>
+                <w:szCs w:val="20"/>
+              </w:rPr>
+            </w:pPr>
+            <w:r>
+              <w:rPr>
+                <w:sz w:val="20"/>
+                <w:szCs w:val="20"/>
+              </w:rPr>
+              <w:t xml:space="preserve">Startup time (per </w:t>
+            </w:r>
+            <w:proofErr w:type="spellStart"/>
+            <w:r>
+              <w:rPr>
+                <w:sz w:val="20"/>
+                <w:szCs w:val="20"/>
+              </w:rPr>
+              <w:t>Skydio</w:t>
+            </w:r>
+            <w:proofErr w:type="spellEnd"/>
+            <w:r>
+              <w:rPr>
+                <w:sz w:val="20"/>
+                <w:szCs w:val="20"/>
+              </w:rPr>
+              <w:t xml:space="preserve"> X10 spec)</w:t>
+            </w:r>
+          </w:p>
+        </w:tc>
+        <w:tc>
+          <w:tcPr>
+            <w:tcW w:w="0" w:type="auto"/>
+            <w:noWrap/>
+            <w:tcMar>
+              <w:top w:w="75" w:type="dxa"/>
+              <w:left w:w="135" w:type="dxa"/>
+              <w:bottom w:w="75" w:type="dxa"/>
+              <w:right w:w="135" w:type="dxa"/>
+            </w:tcMar>
+            <w:vAlign w:val="center"/>
+            <w:hideMark/>
+          </w:tcPr>
+          <w:p>
+            <w:pPr>
+              <w:rPr>
+                <w:sz w:val="20"/>
+                <w:szCs w:val="20"/>
+              </w:rPr>
+            </w:pPr>
+            <w:r>
+              <w:rPr>
+                <w:sz w:val="20"/>
+                <w:szCs w:val="20"/>
+              </w:rPr>
+              <w:t>under 40 seconds</w:t>
+            </w:r>
+          </w:p>
+        </w:tc>
+      </w:tr>
+      <w:tr>
+        <w:tc>
+          <w:tcPr>
+            <w:tcW w:w="0" w:type="auto"/>
+            <w:noWrap/>
+            <w:tcMar>
+              <w:top w:w="75" w:type="dxa"/>
+              <w:left w:w="135" w:type="dxa"/>
+              <w:bottom w:w="75" w:type="dxa"/>
+              <w:right w:w="135" w:type="dxa"/>
+            </w:tcMar>
+            <w:vAlign w:val="center"/>
+            <w:hideMark/>
+          </w:tcPr>
+          <w:p>
+            <w:pPr>
+              <w:rPr>
+                <w:sz w:val="20"/>
+                <w:szCs w:val="20"/>
+              </w:rPr>
+            </w:pPr>
+            <w:r>
+              <w:rPr>
+                <w:sz w:val="20"/>
+                <w:szCs w:val="20"/>
+              </w:rPr>
+              <w:t>DFR (Drone as First Responder) target</w:t>
+            </w:r>
+          </w:p>
+        </w:tc>
+        <w:tc>
+          <w:tcPr>
+            <w:tcW w:w="0" w:type="auto"/>
+            <w:noWrap/>
+            <w:tcMar>
+              <w:top w:w="75" w:type="dxa"/>
+              <w:left w:w="135" w:type="dxa"/>
+              <w:bottom w:w="75" w:type="dxa"/>
+              <w:right w:w="135" w:type="dxa"/>
+            </w:tcMar>
+            <w:vAlign w:val="center"/>
+            <w:hideMark/>
+          </w:tcPr>
+          <w:p>
+            <w:pPr>
+              <w:rPr>
+                <w:sz w:val="20"/>
+                <w:szCs w:val="20"/>
+              </w:rPr>
+            </w:pPr>
+            <w:r>
+              <w:rPr>
+                <w:sz w:val="20"/>
+                <w:szCs w:val="20"/>
+              </w:rPr>
+              <w:t>on scene in ≤ 4 minutes</w:t>
+            </w:r>
+          </w:p>
+        </w:tc>
+      </w:tr>
+      <w:tr>
+        <w:tc>
+          <w:tcPr>
+            <w:tcW w:w="0" w:type="auto"/>
+            <w:noWrap/>
+            <w:tcMar>
+              <w:top w:w="75" w:type="dxa"/>
+              <w:left w:w="135" w:type="dxa"/>
+              <w:bottom w:w="75" w:type="dxa"/>
+              <w:right w:w="135" w:type="dxa"/>
+            </w:tcMar>
+            <w:vAlign w:val="center"/>
+            <w:hideMark/>
+          </w:tcPr>
+          <w:p>
+            <w:pPr>
+              <w:rPr>
+                <w:sz w:val="20"/>
+                <w:szCs w:val="20"/>
+              </w:rPr>
+            </w:pPr>
+            <w:r>
+              <w:rPr>
+                <w:sz w:val="20"/>
+                <w:szCs w:val="20"/>
+              </w:rPr>
+              <w:t>Available travel time</w:t>
+            </w:r>
+          </w:p>
+        </w:tc>
+        <w:tc>
+          <w:tcPr>
+            <w:tcW w:w="0" w:type="auto"/>
+            <w:noWrap/>
+            <w:tcMar>
+              <w:top w:w="75" w:type="dxa"/>
+              <w:left w:w="135" w:type="dxa"/>
+              <w:bottom w:w="75" w:type="dxa"/>
+              <w:right w:w="135" w:type="dxa"/>
+            </w:tcMar>
+            <w:vAlign w:val="center"/>
+            <w:hideMark/>
+          </w:tcPr>
+          <w:p>
+            <w:pPr>
+              <w:rPr>
+                <w:sz w:val="20"/>
+                <w:szCs w:val="20"/>
+              </w:rPr>
+            </w:pPr>
+            <w:r>
+              <w:rPr>
+                <w:sz w:val="20"/>
+                <w:szCs w:val="20"/>
+              </w:rPr>
+              <w:t>4 min − 40 s startup = </w:t>
+            </w:r>
+            <w:r>
+              <w:rPr>
+                <w:b/>
+                <w:bCs/>
+                <w:sz w:val="20"/>
+                <w:szCs w:val="20"/>
+              </w:rPr>
+              <w:t>200 seconds</w:t>
+            </w:r>
+          </w:p>
+        </w:tc>
+      </w:tr>
+      <w:tr>
+        <w:tc>
+          <w:tcPr>
+            <w:tcW w:w="0" w:type="auto"/>
+            <w:noWrap/>
+            <w:tcMar>
+              <w:top w:w="75" w:type="dxa"/>
+              <w:left w:w="135" w:type="dxa"/>
+              <w:bottom w:w="75" w:type="dxa"/>
+              <w:right w:w="135" w:type="dxa"/>
+            </w:tcMar>
+            <w:vAlign w:val="center"/>
+            <w:hideMark/>
+          </w:tcPr>
+          <w:p>
+            <w:pPr>
+              <w:rPr>
+                <w:sz w:val="20"/>
+                <w:szCs w:val="20"/>
+              </w:rPr>
+            </w:pPr>
+            <w:r>
+              <w:rPr>
+                <w:sz w:val="20"/>
+                <w:szCs w:val="20"/>
+              </w:rPr>
+              <w:t>Radius = 16 m/s × 200 s</w:t>
+            </w:r>
+          </w:p>
+        </w:tc>
+        <w:tc>
+          <w:tcPr>
+            <w:tcW w:w="0" w:type="auto"/>
+            <w:noWrap/>
+            <w:tcMar>
+              <w:top w:w="75" w:type="dxa"/>
+              <w:left w:w="135" w:type="dxa"/>
+              <w:bottom w:w="75" w:type="dxa"/>
+              <w:right w:w="135" w:type="dxa"/>
+            </w:tcMar>
+            <w:vAlign w:val="center"/>
+            <w:hideMark/>
+          </w:tcPr>
+          <w:p>
+            <w:pPr>
+              <w:rPr>
+                <w:sz w:val="20"/>
+                <w:szCs w:val="20"/>
+              </w:rPr>
+            </w:pPr>
+            <w:r>
+              <w:rPr>
+                <w:sz w:val="20"/>
+                <w:szCs w:val="20"/>
+              </w:rPr>
+              <w:t>= 3,200 m = </w:t>
+            </w:r>
+            <w:r>
+              <w:rPr>
+                <w:b/>
+                <w:bCs/>
+                <w:sz w:val="20"/>
+                <w:szCs w:val="20"/>
+              </w:rPr>
+              <w:t>3.2 km ≈ 2.0 miles</w:t>
+            </w:r>
+          </w:p>
+        </w:tc>
+      </w:tr>
+    </w:tbl>
+    <w:p>
+      <w:r>
+        <w:t xml:space="preserve">The 35.8 mph speed (16 m/s) is the </w:t>
+      </w:r>
+      <w:proofErr w:type="spellStart"/>
+      <w:r>
+        <w:t>Skydio</w:t>
+      </w:r>
+      <w:proofErr w:type="spellEnd"/>
+      <w:r>
+        <w:t xml:space="preserve"> X10's maximum ground speed with standard obstacle avoidance enabled — the appropriate setting for urban/suburban DFR response. The absolute maximum of 45 mph is not used as it requires disabling obstacle avoidance, which is unsafe for flight through built environments. Startup time is explicitly deducted from the 4-minute window per the spec's "under 40 seconds" figure, yielding 200 seconds of actual travel time.</w:t>
+      </w:r>
+    </w:p>
+    <w:p/>
+    <w:p/>
+    <w:p/>
+    <w:p/>
+    <w:p/>
+    <w:p/>
+    <w:p/>
+    <w:p/>
+    <w:p/>
+    <w:p/>
+    <w:p/>
+    <w:p/>
+    <w:p/>
+    <w:p/>
+    <w:p/>
+    <w:p/>
+    <w:p/>
+    <w:p/>
+    <w:p/>
+    <w:p/>
+    <w:p/>
+    <w:p/>
+    <w:p/>
+    <w:p/>
+    <w:p/>
+    <w:p/>
+    <w:p/>
+    <w:p/>
+    <w:p/>
+    <w:p/>
+    <w:p/>
+    <w:p/>
+    <w:p/>
+    <w:p/>
     <w:sectPr>
       <w:pgSz w:w="12240" w:h="15840"/>
       <w:pgMar w:top="1440" w:right="1440" w:bottom="1440" w:left="1440" w:header="720" w:footer="720" w:gutter="0"/>

</xml_diff>

<commit_message>
- Add get_incidents_by_agency and get_agency_dock_crosstab functions with agency normalization and Incident ID prefix inference (LFD/LMPD) - Add chart_incidents_by_agency, chart_agency_dock_heatmap, and chart_agency_dock_heatmap_pct to visualizations
</commit_message>
<xml_diff>
--- a/Notes.docx
+++ b/Notes.docx
@@ -168,6 +168,12 @@
       </w:r>
     </w:p>
     <w:p>
+      <w:pPr>
+        <w:ind w:left="360"/>
+        <w:rPr>
+          <w:highlight w:val="yellow"/>
+        </w:rPr>
+      </w:pPr>
       <w:proofErr w:type="spellStart"/>
       <w:r>
         <w:t>Categoria</w:t>
@@ -194,10 +200,9 @@
       </w:r>
       <w:r>
         <w:rPr>
-          <w:b/>
-          <w:bCs/>
-        </w:rPr>
-        <w:t>Training/Test flights</w:t>
+          <w:highlight w:val="yellow"/>
+        </w:rPr>
+        <w:t>Non-operational (i.e. training flight)</w:t>
       </w:r>
     </w:p>
     <w:p/>
@@ -652,13 +657,37 @@
         <w:pStyle w:val="ListParagraph"/>
       </w:pPr>
       <w:r>
-        <w:t>How did the drone assist with the call?</w:t>
-      </w:r>
-      <w:r>
-        <w:t xml:space="preserve">: </w:t>
-      </w:r>
-      <w:r>
-        <w:t>Located person, Provided overwatch, Helped make arrest</w:t>
+        <w:t xml:space="preserve">How did the drone assist with the </w:t>
+      </w:r>
+      <w:proofErr w:type="gramStart"/>
+      <w:r>
+        <w:t>call?</w:t>
+      </w:r>
+      <w:r>
+        <w:t>:</w:t>
+      </w:r>
+      <w:proofErr w:type="gramEnd"/>
+      <w:r>
+        <w:t xml:space="preserve"> </w:t>
+      </w:r>
+      <w:r>
+        <w:t xml:space="preserve">Located person, </w:t>
+      </w:r>
+      <w:proofErr w:type="gramStart"/>
+      <w:r>
+        <w:t>Provided</w:t>
+      </w:r>
+      <w:proofErr w:type="gramEnd"/>
+      <w:r>
+        <w:t xml:space="preserve"> overwatch, </w:t>
+      </w:r>
+      <w:proofErr w:type="gramStart"/>
+      <w:r>
+        <w:t>Helped</w:t>
+      </w:r>
+      <w:proofErr w:type="gramEnd"/>
+      <w:r>
+        <w:t xml:space="preserve"> make arrest</w:t>
       </w:r>
     </w:p>
     <w:p>
@@ -787,116 +816,6 @@
     </w:p>
     <w:p>
       <w:pPr>
-        <w:rPr>
-          <w:lang w:val="es-419"/>
-        </w:rPr>
-      </w:pPr>
-      <w:r>
-        <w:rPr>
-          <w:lang w:val="es-419"/>
-        </w:rPr>
-        <w:t>Esta</w:t>
-      </w:r>
-      <w:r>
-        <w:rPr>
-          <w:lang w:val="es-419"/>
-        </w:rPr>
-        <w:t>s</w:t>
-      </w:r>
-      <w:r>
-        <w:rPr>
-          <w:lang w:val="es-419"/>
-        </w:rPr>
-        <w:t xml:space="preserve"> tarea</w:t>
-      </w:r>
-      <w:r>
-        <w:rPr>
-          <w:lang w:val="es-419"/>
-        </w:rPr>
-        <w:t>s</w:t>
-      </w:r>
-      <w:r>
-        <w:rPr>
-          <w:lang w:val="es-419"/>
-        </w:rPr>
-        <w:t xml:space="preserve"> no tiene</w:t>
-      </w:r>
-      <w:r>
-        <w:rPr>
-          <w:lang w:val="es-419"/>
-        </w:rPr>
-        <w:t>n</w:t>
-      </w:r>
-      <w:r>
-        <w:rPr>
-          <w:lang w:val="es-419"/>
-        </w:rPr>
-        <w:t xml:space="preserve"> d</w:t>
-      </w:r>
-      <w:r>
-        <w:rPr>
-          <w:lang w:val="es-419"/>
-        </w:rPr>
-        <w:t>atos directos para desarrollarla</w:t>
-      </w:r>
-      <w:r>
-        <w:rPr>
-          <w:lang w:val="es-419"/>
-        </w:rPr>
-        <w:t xml:space="preserve"> (preguntar si existen registros de </w:t>
-      </w:r>
-      <w:proofErr w:type="spellStart"/>
-      <w:r>
-        <w:rPr>
-          <w:lang w:val="es-419"/>
-        </w:rPr>
-        <w:t>location</w:t>
-      </w:r>
-      <w:proofErr w:type="spellEnd"/>
-      <w:r>
-        <w:rPr>
-          <w:lang w:val="es-419"/>
-        </w:rPr>
-        <w:t xml:space="preserve"> de incidentes de cada </w:t>
-      </w:r>
-      <w:proofErr w:type="spellStart"/>
-      <w:r>
-        <w:rPr>
-          <w:lang w:val="es-419"/>
-        </w:rPr>
-        <w:t>flight</w:t>
-      </w:r>
-      <w:proofErr w:type="spellEnd"/>
-      <w:r>
-        <w:rPr>
-          <w:lang w:val="es-419"/>
-        </w:rPr>
-        <w:t xml:space="preserve">. La idea que tengo es relacionar el lugar del incidente con la base desde donde despego el </w:t>
-      </w:r>
-      <w:proofErr w:type="spellStart"/>
-      <w:r>
-        <w:rPr>
-          <w:lang w:val="es-419"/>
-        </w:rPr>
-        <w:t>drone</w:t>
-      </w:r>
-      <w:proofErr w:type="spellEnd"/>
-      <w:r>
-        <w:rPr>
-          <w:lang w:val="es-419"/>
-        </w:rPr>
-        <w:t>.</w:t>
-      </w:r>
-    </w:p>
-    <w:p>
-      <w:pPr>
-        <w:rPr>
-          <w:lang w:val="es-419"/>
-        </w:rPr>
-      </w:pPr>
-    </w:p>
-    <w:p>
-      <w:pPr>
         <w:pStyle w:val="ListParagraph"/>
         <w:numPr>
           <w:ilvl w:val="0"/>
@@ -907,11 +826,131 @@
         </w:rPr>
       </w:pPr>
       <w:r>
-        <w:rPr>
-          <w:lang w:val="es-419"/>
-        </w:rPr>
-        <w:t>Excluir los incidentes en la categoría Training o Test de las estadísticas para obtener realmente estadísticas de incidentes</w:t>
-      </w:r>
+        <w:t>Response time summary statistics</w:t>
+      </w:r>
+      <w:proofErr w:type="gramStart"/>
+      <w:r>
+        <w:t>.</w:t>
+      </w:r>
+      <w:r>
+        <w:t xml:space="preserve"> ????</w:t>
+      </w:r>
+      <w:proofErr w:type="gramEnd"/>
+    </w:p>
+    <w:p>
+      <w:pPr>
+        <w:ind w:left="360"/>
+      </w:pPr>
+    </w:p>
+    <w:p>
+      <w:pPr>
+        <w:rPr>
+          <w:lang w:val="es-419"/>
+        </w:rPr>
+      </w:pPr>
+      <w:r>
+        <w:rPr>
+          <w:lang w:val="es-419"/>
+        </w:rPr>
+        <w:t>Esta</w:t>
+      </w:r>
+      <w:r>
+        <w:rPr>
+          <w:lang w:val="es-419"/>
+        </w:rPr>
+        <w:t>s</w:t>
+      </w:r>
+      <w:r>
+        <w:rPr>
+          <w:lang w:val="es-419"/>
+        </w:rPr>
+        <w:t xml:space="preserve"> tarea</w:t>
+      </w:r>
+      <w:r>
+        <w:rPr>
+          <w:lang w:val="es-419"/>
+        </w:rPr>
+        <w:t>s</w:t>
+      </w:r>
+      <w:r>
+        <w:rPr>
+          <w:lang w:val="es-419"/>
+        </w:rPr>
+        <w:t xml:space="preserve"> no tiene</w:t>
+      </w:r>
+      <w:r>
+        <w:rPr>
+          <w:lang w:val="es-419"/>
+        </w:rPr>
+        <w:t>n</w:t>
+      </w:r>
+      <w:r>
+        <w:rPr>
+          <w:lang w:val="es-419"/>
+        </w:rPr>
+        <w:t xml:space="preserve"> d</w:t>
+      </w:r>
+      <w:r>
+        <w:rPr>
+          <w:lang w:val="es-419"/>
+        </w:rPr>
+        <w:t>atos directos para desarrollarla</w:t>
+      </w:r>
+      <w:r>
+        <w:rPr>
+          <w:lang w:val="es-419"/>
+        </w:rPr>
+        <w:t xml:space="preserve"> (preguntar si existen registros de </w:t>
+      </w:r>
+      <w:proofErr w:type="spellStart"/>
+      <w:r>
+        <w:rPr>
+          <w:lang w:val="es-419"/>
+        </w:rPr>
+        <w:t>location</w:t>
+      </w:r>
+      <w:proofErr w:type="spellEnd"/>
+      <w:r>
+        <w:rPr>
+          <w:lang w:val="es-419"/>
+        </w:rPr>
+        <w:t xml:space="preserve"> de incidentes de cada </w:t>
+      </w:r>
+      <w:proofErr w:type="spellStart"/>
+      <w:r>
+        <w:rPr>
+          <w:lang w:val="es-419"/>
+        </w:rPr>
+        <w:t>flight</w:t>
+      </w:r>
+      <w:proofErr w:type="spellEnd"/>
+      <w:r>
+        <w:rPr>
+          <w:lang w:val="es-419"/>
+        </w:rPr>
+        <w:t xml:space="preserve">. La idea que tengo es relacionar el lugar del incidente con la base desde donde despego el </w:t>
+      </w:r>
+      <w:proofErr w:type="spellStart"/>
+      <w:r>
+        <w:rPr>
+          <w:lang w:val="es-419"/>
+        </w:rPr>
+        <w:t>drone</w:t>
+      </w:r>
+      <w:proofErr w:type="spellEnd"/>
+      <w:r>
+        <w:rPr>
+          <w:lang w:val="es-419"/>
+        </w:rPr>
+        <w:t>.</w:t>
+      </w:r>
+    </w:p>
+    <w:p>
+      <w:pPr>
+        <w:rPr>
+          <w:lang w:val="es-419"/>
+        </w:rPr>
+      </w:pPr>
     </w:p>
     <w:p>
       <w:pPr>
@@ -925,10 +964,10 @@
         </w:rPr>
       </w:pPr>
       <w:r>
-        <w:t>Response time summary statistics.</w:t>
-      </w:r>
-      <w:r>
-        <w:t xml:space="preserve"> ????</w:t>
+        <w:rPr>
+          <w:lang w:val="es-419"/>
+        </w:rPr>
+        <w:t>Excluir los incidentes en la categoría Training o Test de las estadísticas para obtener realmente estadísticas de incidentes</w:t>
       </w:r>
     </w:p>
     <w:p>
@@ -1406,7 +1445,11 @@
       </w:r>
       <w:proofErr w:type="spellEnd"/>
       <w:r>
-        <w:t xml:space="preserve"> X10's maximum ground speed with standard obstacle avoidance enabled — the appropriate setting for urban/suburban DFR response. The absolute maximum of 45 mph is not used as it requires disabling obstacle avoidance, which is unsafe for flight through built environments. Startup time is explicitly deducted from the 4-minute window per the spec's "under 40 seconds" figure, yielding 200 seconds of actual travel time.</w:t>
+        <w:t xml:space="preserve"> X10's maximum ground speed with standard obstacle avoidance enabled — the appropriate setting for urban/suburban DFR response. The absolute maximum of 45 mph is not used as it requires disabling obstacle avoidance, which is unsafe for flight through built environments. Startup time is explicitly deducted </w:t>
+      </w:r>
+      <w:r>
+        <w:lastRenderedPageBreak/>
+        <w:t>from the 4-minute window per the spec's "under 40 seconds" figure, yielding 200 seconds of actual travel time.</w:t>
       </w:r>
     </w:p>
     <w:p/>
@@ -2269,6 +2312,7 @@
   <w:style w:type="character" w:default="1" w:styleId="DefaultParagraphFont">
     <w:name w:val="Default Paragraph Font"/>
     <w:uiPriority w:val="1"/>
+    <w:semiHidden/>
     <w:unhideWhenUsed/>
   </w:style>
   <w:style w:type="table" w:default="1" w:styleId="TableNormal">

</xml_diff>